<commit_message>
fix: correção dos fluxos seguindo como base as telas atualizadas. Issue #33
</commit_message>
<xml_diff>
--- a/Requisitos/UC10_Manter Serviço.docx
+++ b/Requisitos/UC10_Manter Serviço.docx
@@ -1,6 +1,6 @@
 
 <file path=word/document.xml><?xml version="1.0" encoding="utf-8"?>
-<w:document xmlns:wpc="http://schemas.microsoft.com/office/word/2010/wordprocessingCanvas" xmlns:cx="http://schemas.microsoft.com/office/drawing/2014/chartex" xmlns:cx1="http://schemas.microsoft.com/office/drawing/2015/9/8/chartex" xmlns:cx2="http://schemas.microsoft.com/office/drawing/2015/10/21/chartex" xmlns:cx3="http://schemas.microsoft.com/office/drawing/2016/5/9/chartex" xmlns:cx4="http://schemas.microsoft.com/office/drawing/2016/5/10/chartex" xmlns:cx5="http://schemas.microsoft.com/office/drawing/2016/5/11/chartex" xmlns:cx6="http://schemas.microsoft.com/office/drawing/2016/5/12/chartex" xmlns:cx7="http://schemas.microsoft.com/office/drawing/2016/5/13/chartex" xmlns:cx8="http://schemas.microsoft.com/office/drawing/2016/5/14/chartex" xmlns:mc="http://schemas.openxmlformats.org/markup-compatibility/2006" xmlns:aink="http://schemas.microsoft.com/office/drawing/2016/ink" xmlns:am3d="http://schemas.microsoft.com/office/drawing/2017/model3d" xmlns:o="urn:schemas-microsoft-com:office:office" xmlns:oel="http://schemas.microsoft.com/office/2019/extlst" xmlns:r="http://schemas.openxmlformats.org/officeDocument/2006/relationships" xmlns:m="http://schemas.openxmlformats.org/officeDocument/2006/math" xmlns:v="urn:schemas-microsoft-com:vml" xmlns:wp14="http://schemas.microsoft.com/office/word/2010/wordprocessingDrawing" xmlns:wp="http://schemas.openxmlformats.org/drawingml/2006/wordprocessingDrawing" xmlns:w10="urn:schemas-microsoft-com:office:word" xmlns:w="http://schemas.openxmlformats.org/wordprocessingml/2006/main" xmlns:w14="http://schemas.microsoft.com/office/word/2010/wordml" xmlns:w15="http://schemas.microsoft.com/office/word/2012/wordml" xmlns:w16cex="http://schemas.microsoft.com/office/word/2018/wordml/cex" xmlns:w16cid="http://schemas.microsoft.com/office/word/2016/wordml/cid" xmlns:w16="http://schemas.microsoft.com/office/word/2018/wordml" xmlns:w16du="http://schemas.microsoft.com/office/word/2023/wordml/word16du" xmlns:w16sdtdh="http://schemas.microsoft.com/office/word/2020/wordml/sdtdatahash" xmlns:w16sdtfl="http://schemas.microsoft.com/office/word/2024/wordml/sdtformatlock" xmlns:w16se="http://schemas.microsoft.com/office/word/2015/wordml/symex" xmlns:wpg="http://schemas.microsoft.com/office/word/2010/wordprocessingGroup" xmlns:wpi="http://schemas.microsoft.com/office/word/2010/wordprocessingInk" xmlns:wne="http://schemas.microsoft.com/office/word/2006/wordml" xmlns:wps="http://schemas.microsoft.com/office/word/2010/wordprocessingShape" mc:Ignorable="w14 w15 w16se w16cid w16 w16cex w16sdtdh w16sdtfl w16du wp14">
+<w:document xmlns:wpc="http://schemas.microsoft.com/office/word/2010/wordprocessingCanvas" xmlns:cx="http://schemas.microsoft.com/office/drawing/2014/chartex" xmlns:cx1="http://schemas.microsoft.com/office/drawing/2015/9/8/chartex" xmlns:cx2="http://schemas.microsoft.com/office/drawing/2015/10/21/chartex" xmlns:cx3="http://schemas.microsoft.com/office/drawing/2016/5/9/chartex" xmlns:cx4="http://schemas.microsoft.com/office/drawing/2016/5/10/chartex" xmlns:cx5="http://schemas.microsoft.com/office/drawing/2016/5/11/chartex" xmlns:cx6="http://schemas.microsoft.com/office/drawing/2016/5/12/chartex" xmlns:cx7="http://schemas.microsoft.com/office/drawing/2016/5/13/chartex" xmlns:cx8="http://schemas.microsoft.com/office/drawing/2016/5/14/chartex" xmlns:mc="http://schemas.openxmlformats.org/markup-compatibility/2006" xmlns:aink="http://schemas.microsoft.com/office/drawing/2016/ink" xmlns:am3d="http://schemas.microsoft.com/office/drawing/2017/model3d" xmlns:o="urn:schemas-microsoft-com:office:office" xmlns:oel="http://schemas.microsoft.com/office/2019/extlst" xmlns:r="http://schemas.openxmlformats.org/officeDocument/2006/relationships" xmlns:m="http://schemas.openxmlformats.org/officeDocument/2006/math" xmlns:v="urn:schemas-microsoft-com:vml" xmlns:wp14="http://schemas.microsoft.com/office/word/2010/wordprocessingDrawing" xmlns:wp="http://schemas.openxmlformats.org/drawingml/2006/wordprocessingDrawing" xmlns:w10="urn:schemas-microsoft-com:office:word" xmlns:w="http://schemas.openxmlformats.org/wordprocessingml/2006/main" xmlns:w14="http://schemas.microsoft.com/office/word/2010/wordml" xmlns:w15="http://schemas.microsoft.com/office/word/2012/wordml" xmlns:w16cex="http://schemas.microsoft.com/office/word/2018/wordml/cex" xmlns:w16cid="http://schemas.microsoft.com/office/word/2016/wordml/cid" xmlns:w16="http://schemas.microsoft.com/office/word/2018/wordml" xmlns:w16du="http://schemas.microsoft.com/office/word/2023/wordml/word16du" xmlns:w16sdtdh="http://schemas.microsoft.com/office/word/2020/wordml/sdtdatahash" xmlns:w16se="http://schemas.microsoft.com/office/word/2015/wordml/symex" xmlns:wpg="http://schemas.microsoft.com/office/word/2010/wordprocessingGroup" xmlns:wpi="http://schemas.microsoft.com/office/word/2010/wordprocessingInk" xmlns:wne="http://schemas.microsoft.com/office/word/2006/wordml" xmlns:wps="http://schemas.microsoft.com/office/word/2010/wordprocessingShape" mc:Ignorable="w14 w15 w16se w16cid w16 w16cex w16sdtdh wp14">
   <w:body>
     <w:p>
       <w:pPr>
@@ -43,6 +43,7 @@
         <w:rPr>
           <w:sz w:val="32"/>
           <w:szCs w:val="32"/>
+          <w:u w:val="single"/>
         </w:rPr>
       </w:pPr>
     </w:p>
@@ -354,8 +355,18 @@
                 <w:sz w:val="28"/>
                 <w:szCs w:val="28"/>
               </w:rPr>
-              <w:t>UC01-Autenticar Usuario</w:t>
-            </w:r>
+              <w:t xml:space="preserve">UC01-Autenticar </w:t>
+            </w:r>
+            <w:proofErr w:type="spellStart"/>
+            <w:r>
+              <w:rPr>
+                <w:color w:val="FF0000"/>
+                <w:sz w:val="28"/>
+                <w:szCs w:val="28"/>
+              </w:rPr>
+              <w:t>Usuario</w:t>
+            </w:r>
+            <w:proofErr w:type="spellEnd"/>
             <w:r>
               <w:rPr>
                 <w:color w:val="000000"/>
@@ -573,7 +584,23 @@
                 <w:sz w:val="28"/>
                 <w:szCs w:val="28"/>
               </w:rPr>
-              <w:t>3. Ator seleciona uma das 3 opções disponibilizadas pelo sistema.</w:t>
+              <w:t xml:space="preserve">3. Ator seleciona uma das </w:t>
+            </w:r>
+            <w:r>
+              <w:rPr>
+                <w:color w:val="000000"/>
+                <w:sz w:val="28"/>
+                <w:szCs w:val="28"/>
+              </w:rPr>
+              <w:t>4</w:t>
+            </w:r>
+            <w:r>
+              <w:rPr>
+                <w:color w:val="000000"/>
+                <w:sz w:val="28"/>
+                <w:szCs w:val="28"/>
+              </w:rPr>
+              <w:t xml:space="preserve"> opções disponibilizadas pelo sistema.</w:t>
             </w:r>
           </w:p>
           <w:p>
@@ -705,23 +732,7 @@
                 <w:sz w:val="28"/>
                 <w:szCs w:val="28"/>
               </w:rPr>
-              <w:t xml:space="preserve">Seção </w:t>
-            </w:r>
-            <w:r>
-              <w:rPr>
-                <w:color w:val="FF0000"/>
-                <w:sz w:val="28"/>
-                <w:szCs w:val="28"/>
-              </w:rPr>
-              <w:t xml:space="preserve">Alterar </w:t>
-            </w:r>
-            <w:r>
-              <w:rPr>
-                <w:color w:val="FF0000"/>
-                <w:sz w:val="28"/>
-                <w:szCs w:val="28"/>
-              </w:rPr>
-              <w:t>Serviço</w:t>
+              <w:t>Seção Alterar Serviço</w:t>
             </w:r>
           </w:p>
           <w:p>
@@ -786,23 +797,7 @@
                 <w:sz w:val="28"/>
                 <w:szCs w:val="28"/>
               </w:rPr>
-              <w:t xml:space="preserve">Seção </w:t>
-            </w:r>
-            <w:r>
-              <w:rPr>
-                <w:color w:val="FF0000"/>
-                <w:sz w:val="28"/>
-                <w:szCs w:val="28"/>
-              </w:rPr>
-              <w:t xml:space="preserve">Remover </w:t>
-            </w:r>
-            <w:r>
-              <w:rPr>
-                <w:color w:val="FF0000"/>
-                <w:sz w:val="28"/>
-                <w:szCs w:val="28"/>
-              </w:rPr>
-              <w:t>Serviço</w:t>
+              <w:t>Seção Remover Serviço</w:t>
             </w:r>
           </w:p>
           <w:p>
@@ -1359,8 +1354,18 @@
                 <w:sz w:val="28"/>
                 <w:szCs w:val="28"/>
               </w:rPr>
-              <w:t>DD-BemMeCare</w:t>
-            </w:r>
+              <w:t>DD-</w:t>
+            </w:r>
+            <w:proofErr w:type="spellStart"/>
+            <w:r>
+              <w:rPr>
+                <w:color w:val="FF0000"/>
+                <w:sz w:val="28"/>
+                <w:szCs w:val="28"/>
+              </w:rPr>
+              <w:t>BemMeCare</w:t>
+            </w:r>
+            <w:proofErr w:type="spellEnd"/>
             <w:r>
               <w:rPr>
                 <w:color w:val="000000"/>
@@ -1375,15 +1380,7 @@
                 <w:sz w:val="28"/>
                 <w:szCs w:val="28"/>
               </w:rPr>
-              <w:t>Tela_02</w:t>
-            </w:r>
-            <w:r>
-              <w:rPr>
-                <w:color w:val="FF0000"/>
-                <w:sz w:val="28"/>
-                <w:szCs w:val="28"/>
-              </w:rPr>
-              <w:t>6</w:t>
+              <w:t>Tela_026</w:t>
             </w:r>
             <w:r>
               <w:rPr>
@@ -1471,8 +1468,18 @@
                 <w:sz w:val="28"/>
                 <w:szCs w:val="28"/>
               </w:rPr>
-              <w:t>DD-BemMeCare</w:t>
-            </w:r>
+              <w:t>DD-</w:t>
+            </w:r>
+            <w:proofErr w:type="spellStart"/>
+            <w:r>
+              <w:rPr>
+                <w:color w:val="FF0000"/>
+                <w:sz w:val="28"/>
+                <w:szCs w:val="28"/>
+              </w:rPr>
+              <w:t>BemMeCare</w:t>
+            </w:r>
+            <w:proofErr w:type="spellEnd"/>
             <w:r>
               <w:rPr>
                 <w:color w:val="000000"/>
@@ -1730,8 +1737,17 @@
                 <w:sz w:val="28"/>
                 <w:szCs w:val="28"/>
               </w:rPr>
-              <w:t xml:space="preserve">     1. Ator informa que serviço possui anamense</w:t>
-            </w:r>
+              <w:t xml:space="preserve">     1. Ator informa que serviço possui </w:t>
+            </w:r>
+            <w:proofErr w:type="spellStart"/>
+            <w:r>
+              <w:rPr>
+                <w:sz w:val="28"/>
+                <w:szCs w:val="28"/>
+              </w:rPr>
+              <w:t>anamense</w:t>
+            </w:r>
+            <w:proofErr w:type="spellEnd"/>
           </w:p>
           <w:p>
             <w:pPr>
@@ -1746,14 +1762,39 @@
                 <w:sz w:val="28"/>
                 <w:szCs w:val="28"/>
               </w:rPr>
-              <w:t xml:space="preserve">     2. Sistema exibe link de Google Forms para profissional preencher a anamense e </w:t>
-            </w:r>
-            <w:r>
-              <w:rPr>
-                <w:sz w:val="28"/>
-                <w:szCs w:val="28"/>
-              </w:rPr>
-              <w:t>conclui adição (</w:t>
+              <w:t xml:space="preserve">     2. Sistema exibe link de Google </w:t>
+            </w:r>
+            <w:proofErr w:type="spellStart"/>
+            <w:r>
+              <w:rPr>
+                <w:sz w:val="28"/>
+                <w:szCs w:val="28"/>
+              </w:rPr>
+              <w:t>Forms</w:t>
+            </w:r>
+            <w:proofErr w:type="spellEnd"/>
+            <w:r>
+              <w:rPr>
+                <w:sz w:val="28"/>
+                <w:szCs w:val="28"/>
+              </w:rPr>
+              <w:t xml:space="preserve"> para profissional preencher a </w:t>
+            </w:r>
+            <w:proofErr w:type="spellStart"/>
+            <w:r>
+              <w:rPr>
+                <w:sz w:val="28"/>
+                <w:szCs w:val="28"/>
+              </w:rPr>
+              <w:t>anamense</w:t>
+            </w:r>
+            <w:proofErr w:type="spellEnd"/>
+            <w:r>
+              <w:rPr>
+                <w:sz w:val="28"/>
+                <w:szCs w:val="28"/>
+              </w:rPr>
+              <w:t xml:space="preserve"> e conclui adição (</w:t>
             </w:r>
             <w:r>
               <w:rPr>
@@ -1761,7 +1802,15 @@
                 <w:sz w:val="28"/>
                 <w:szCs w:val="28"/>
               </w:rPr>
-              <w:t>Tela_024</w:t>
+              <w:t>Tela_02</w:t>
+            </w:r>
+            <w:r>
+              <w:rPr>
+                <w:color w:val="FF0000"/>
+                <w:sz w:val="28"/>
+                <w:szCs w:val="28"/>
+              </w:rPr>
+              <w:t>6</w:t>
             </w:r>
             <w:r>
               <w:rPr>
@@ -1791,8 +1840,18 @@
                 <w:sz w:val="28"/>
                 <w:szCs w:val="28"/>
               </w:rPr>
-              <w:t>DD-BemMeCare</w:t>
-            </w:r>
+              <w:t>DD-</w:t>
+            </w:r>
+            <w:proofErr w:type="spellStart"/>
+            <w:r>
+              <w:rPr>
+                <w:color w:val="FF0000"/>
+                <w:sz w:val="28"/>
+                <w:szCs w:val="28"/>
+              </w:rPr>
+              <w:t>BemMeCare</w:t>
+            </w:r>
+            <w:proofErr w:type="spellEnd"/>
             <w:r>
               <w:rPr>
                 <w:sz w:val="28"/>
@@ -1913,8 +1972,18 @@
                 <w:sz w:val="28"/>
                 <w:szCs w:val="28"/>
               </w:rPr>
-              <w:t>DD-BemMeCare</w:t>
-            </w:r>
+              <w:t>DD-</w:t>
+            </w:r>
+            <w:proofErr w:type="spellStart"/>
+            <w:r>
+              <w:rPr>
+                <w:color w:val="FF0000"/>
+                <w:sz w:val="28"/>
+                <w:szCs w:val="28"/>
+              </w:rPr>
+              <w:t>BemMeCare</w:t>
+            </w:r>
+            <w:proofErr w:type="spellEnd"/>
             <w:r>
               <w:rPr>
                 <w:sz w:val="28"/>
@@ -2261,14 +2330,30 @@
                 <w:sz w:val="28"/>
                 <w:szCs w:val="28"/>
               </w:rPr>
-              <w:t>clica no i</w:t>
-            </w:r>
-            <w:r>
-              <w:rPr>
-                <w:sz w:val="28"/>
-                <w:szCs w:val="28"/>
-              </w:rPr>
-              <w:t>cone de olho</w:t>
+              <w:t xml:space="preserve">clica no </w:t>
+            </w:r>
+            <w:proofErr w:type="spellStart"/>
+            <w:r>
+              <w:rPr>
+                <w:sz w:val="28"/>
+                <w:szCs w:val="28"/>
+              </w:rPr>
+              <w:t>i</w:t>
+            </w:r>
+            <w:r>
+              <w:rPr>
+                <w:sz w:val="28"/>
+                <w:szCs w:val="28"/>
+              </w:rPr>
+              <w:t>cone</w:t>
+            </w:r>
+            <w:proofErr w:type="spellEnd"/>
+            <w:r>
+              <w:rPr>
+                <w:sz w:val="28"/>
+                <w:szCs w:val="28"/>
+              </w:rPr>
+              <w:t xml:space="preserve"> de olho</w:t>
             </w:r>
             <w:r>
               <w:rPr>
@@ -2381,7 +2466,21 @@
                 <w:sz w:val="28"/>
                 <w:szCs w:val="28"/>
               </w:rPr>
-              <w:t>clica em “Cancelar”</w:t>
+              <w:t>clica em “</w:t>
+            </w:r>
+            <w:r>
+              <w:rPr>
+                <w:sz w:val="28"/>
+                <w:szCs w:val="28"/>
+              </w:rPr>
+              <w:t>Voltar</w:t>
+            </w:r>
+            <w:r>
+              <w:rPr>
+                <w:sz w:val="28"/>
+                <w:szCs w:val="28"/>
+              </w:rPr>
+              <w:t>”</w:t>
             </w:r>
             <w:r>
               <w:rPr>
@@ -3402,7 +3501,25 @@
                 <w:sz w:val="28"/>
                 <w:szCs w:val="28"/>
               </w:rPr>
-              <w:t>clica no icone de lápis de um</w:t>
+              <w:t xml:space="preserve">clica no </w:t>
+            </w:r>
+            <w:proofErr w:type="spellStart"/>
+            <w:r>
+              <w:rPr>
+                <w:color w:val="000000"/>
+                <w:sz w:val="28"/>
+                <w:szCs w:val="28"/>
+              </w:rPr>
+              <w:t>icone</w:t>
+            </w:r>
+            <w:proofErr w:type="spellEnd"/>
+            <w:r>
+              <w:rPr>
+                <w:color w:val="000000"/>
+                <w:sz w:val="28"/>
+                <w:szCs w:val="28"/>
+              </w:rPr>
+              <w:t xml:space="preserve"> de lápis de um</w:t>
             </w:r>
             <w:r>
               <w:rPr>
@@ -3543,8 +3660,18 @@
                 <w:sz w:val="28"/>
                 <w:szCs w:val="28"/>
               </w:rPr>
-              <w:t>DD-BemMeCare</w:t>
-            </w:r>
+              <w:t>DD-</w:t>
+            </w:r>
+            <w:proofErr w:type="spellStart"/>
+            <w:r>
+              <w:rPr>
+                <w:color w:val="FF0000"/>
+                <w:sz w:val="28"/>
+                <w:szCs w:val="28"/>
+              </w:rPr>
+              <w:t>BemMeCare</w:t>
+            </w:r>
+            <w:proofErr w:type="spellEnd"/>
             <w:r>
               <w:rPr>
                 <w:color w:val="000000"/>
@@ -4145,6 +4272,50 @@
           </w:p>
         </w:tc>
       </w:tr>
+      <w:tr>
+        <w:tc>
+          <w:tcPr>
+            <w:tcW w:w="2628" w:type="dxa"/>
+          </w:tcPr>
+          <w:p>
+            <w:pPr>
+              <w:jc w:val="center"/>
+            </w:pPr>
+            <w:r>
+              <w:t>15/10/2026</w:t>
+            </w:r>
+          </w:p>
+        </w:tc>
+        <w:tc>
+          <w:tcPr>
+            <w:tcW w:w="1800" w:type="dxa"/>
+          </w:tcPr>
+          <w:p>
+            <w:pPr>
+              <w:jc w:val="center"/>
+            </w:pPr>
+            <w:r>
+              <w:t>Igor Lemos</w:t>
+            </w:r>
+          </w:p>
+        </w:tc>
+        <w:tc>
+          <w:tcPr>
+            <w:tcW w:w="6120" w:type="dxa"/>
+          </w:tcPr>
+          <w:p>
+            <w:pPr>
+              <w:jc w:val="center"/>
+              <w:rPr>
+                <w:u w:val="single"/>
+              </w:rPr>
+            </w:pPr>
+            <w:r>
+              <w:t>Acrescenta maior fidelidade às telas</w:t>
+            </w:r>
+          </w:p>
+        </w:tc>
+      </w:tr>
     </w:tbl>
     <w:p>
       <w:pPr>
@@ -4162,7 +4333,7 @@
 </file>
 
 <file path=word/numbering.xml><?xml version="1.0" encoding="utf-8"?>
-<w:numbering xmlns:wpc="http://schemas.microsoft.com/office/word/2010/wordprocessingCanvas" xmlns:cx="http://schemas.microsoft.com/office/drawing/2014/chartex" xmlns:cx1="http://schemas.microsoft.com/office/drawing/2015/9/8/chartex" xmlns:cx2="http://schemas.microsoft.com/office/drawing/2015/10/21/chartex" xmlns:cx3="http://schemas.microsoft.com/office/drawing/2016/5/9/chartex" xmlns:cx4="http://schemas.microsoft.com/office/drawing/2016/5/10/chartex" xmlns:cx5="http://schemas.microsoft.com/office/drawing/2016/5/11/chartex" xmlns:cx6="http://schemas.microsoft.com/office/drawing/2016/5/12/chartex" xmlns:cx7="http://schemas.microsoft.com/office/drawing/2016/5/13/chartex" xmlns:cx8="http://schemas.microsoft.com/office/drawing/2016/5/14/chartex" xmlns:mc="http://schemas.openxmlformats.org/markup-compatibility/2006" xmlns:aink="http://schemas.microsoft.com/office/drawing/2016/ink" xmlns:am3d="http://schemas.microsoft.com/office/drawing/2017/model3d" xmlns:o="urn:schemas-microsoft-com:office:office" xmlns:oel="http://schemas.microsoft.com/office/2019/extlst" xmlns:r="http://schemas.openxmlformats.org/officeDocument/2006/relationships" xmlns:m="http://schemas.openxmlformats.org/officeDocument/2006/math" xmlns:v="urn:schemas-microsoft-com:vml" xmlns:wp14="http://schemas.microsoft.com/office/word/2010/wordprocessingDrawing" xmlns:wp="http://schemas.openxmlformats.org/drawingml/2006/wordprocessingDrawing" xmlns:w10="urn:schemas-microsoft-com:office:word" xmlns:w="http://schemas.openxmlformats.org/wordprocessingml/2006/main" xmlns:w14="http://schemas.microsoft.com/office/word/2010/wordml" xmlns:w15="http://schemas.microsoft.com/office/word/2012/wordml" xmlns:w16cex="http://schemas.microsoft.com/office/word/2018/wordml/cex" xmlns:w16cid="http://schemas.microsoft.com/office/word/2016/wordml/cid" xmlns:w16="http://schemas.microsoft.com/office/word/2018/wordml" xmlns:w16du="http://schemas.microsoft.com/office/word/2023/wordml/word16du" xmlns:w16sdtdh="http://schemas.microsoft.com/office/word/2020/wordml/sdtdatahash" xmlns:w16sdtfl="http://schemas.microsoft.com/office/word/2024/wordml/sdtformatlock" xmlns:w16se="http://schemas.microsoft.com/office/word/2015/wordml/symex" xmlns:wpg="http://schemas.microsoft.com/office/word/2010/wordprocessingGroup" xmlns:wpi="http://schemas.microsoft.com/office/word/2010/wordprocessingInk" xmlns:wne="http://schemas.microsoft.com/office/word/2006/wordml" xmlns:wps="http://schemas.microsoft.com/office/word/2010/wordprocessingShape" mc:Ignorable="w14 w15 w16se w16cid w16 w16cex w16sdtdh w16sdtfl w16du wp14">
+<w:numbering xmlns:wpc="http://schemas.microsoft.com/office/word/2010/wordprocessingCanvas" xmlns:cx="http://schemas.microsoft.com/office/drawing/2014/chartex" xmlns:cx1="http://schemas.microsoft.com/office/drawing/2015/9/8/chartex" xmlns:cx2="http://schemas.microsoft.com/office/drawing/2015/10/21/chartex" xmlns:cx3="http://schemas.microsoft.com/office/drawing/2016/5/9/chartex" xmlns:cx4="http://schemas.microsoft.com/office/drawing/2016/5/10/chartex" xmlns:cx5="http://schemas.microsoft.com/office/drawing/2016/5/11/chartex" xmlns:cx6="http://schemas.microsoft.com/office/drawing/2016/5/12/chartex" xmlns:cx7="http://schemas.microsoft.com/office/drawing/2016/5/13/chartex" xmlns:cx8="http://schemas.microsoft.com/office/drawing/2016/5/14/chartex" xmlns:mc="http://schemas.openxmlformats.org/markup-compatibility/2006" xmlns:aink="http://schemas.microsoft.com/office/drawing/2016/ink" xmlns:am3d="http://schemas.microsoft.com/office/drawing/2017/model3d" xmlns:o="urn:schemas-microsoft-com:office:office" xmlns:oel="http://schemas.microsoft.com/office/2019/extlst" xmlns:r="http://schemas.openxmlformats.org/officeDocument/2006/relationships" xmlns:m="http://schemas.openxmlformats.org/officeDocument/2006/math" xmlns:v="urn:schemas-microsoft-com:vml" xmlns:wp14="http://schemas.microsoft.com/office/word/2010/wordprocessingDrawing" xmlns:wp="http://schemas.openxmlformats.org/drawingml/2006/wordprocessingDrawing" xmlns:w10="urn:schemas-microsoft-com:office:word" xmlns:w="http://schemas.openxmlformats.org/wordprocessingml/2006/main" xmlns:w14="http://schemas.microsoft.com/office/word/2010/wordml" xmlns:w15="http://schemas.microsoft.com/office/word/2012/wordml" xmlns:w16cex="http://schemas.microsoft.com/office/word/2018/wordml/cex" xmlns:w16cid="http://schemas.microsoft.com/office/word/2016/wordml/cid" xmlns:w16="http://schemas.microsoft.com/office/word/2018/wordml" xmlns:w16du="http://schemas.microsoft.com/office/word/2023/wordml/word16du" xmlns:w16sdtdh="http://schemas.microsoft.com/office/word/2020/wordml/sdtdatahash" xmlns:w16se="http://schemas.microsoft.com/office/word/2015/wordml/symex" xmlns:wpg="http://schemas.microsoft.com/office/word/2010/wordprocessingGroup" xmlns:wpi="http://schemas.microsoft.com/office/word/2010/wordprocessingInk" xmlns:wne="http://schemas.microsoft.com/office/word/2006/wordml" xmlns:wps="http://schemas.microsoft.com/office/word/2010/wordprocessingShape" mc:Ignorable="w14 w15 w16se w16cid w16 w16cex w16sdtdh wp14">
   <w:abstractNum w:abstractNumId="0" w15:restartNumberingAfterBreak="0">
     <w:nsid w:val="25683A48"/>
     <w:multiLevelType w:val="multilevel"/>
@@ -4523,7 +4694,7 @@
 </file>
 
 <file path=word/styles.xml><?xml version="1.0" encoding="utf-8"?>
-<w:styles xmlns:mc="http://schemas.openxmlformats.org/markup-compatibility/2006" xmlns:r="http://schemas.openxmlformats.org/officeDocument/2006/relationships" xmlns:w="http://schemas.openxmlformats.org/wordprocessingml/2006/main" xmlns:w14="http://schemas.microsoft.com/office/word/2010/wordml" xmlns:w15="http://schemas.microsoft.com/office/word/2012/wordml" xmlns:w16cex="http://schemas.microsoft.com/office/word/2018/wordml/cex" xmlns:w16cid="http://schemas.microsoft.com/office/word/2016/wordml/cid" xmlns:w16="http://schemas.microsoft.com/office/word/2018/wordml" xmlns:w16du="http://schemas.microsoft.com/office/word/2023/wordml/word16du" xmlns:w16sdtdh="http://schemas.microsoft.com/office/word/2020/wordml/sdtdatahash" xmlns:w16sdtfl="http://schemas.microsoft.com/office/word/2024/wordml/sdtformatlock" xmlns:w16se="http://schemas.microsoft.com/office/word/2015/wordml/symex" mc:Ignorable="w14 w15 w16se w16cid w16 w16cex w16sdtdh w16sdtfl w16du">
+<w:styles xmlns:mc="http://schemas.openxmlformats.org/markup-compatibility/2006" xmlns:r="http://schemas.openxmlformats.org/officeDocument/2006/relationships" xmlns:w="http://schemas.openxmlformats.org/wordprocessingml/2006/main" xmlns:w14="http://schemas.microsoft.com/office/word/2010/wordml" xmlns:w15="http://schemas.microsoft.com/office/word/2012/wordml" xmlns:w16cex="http://schemas.microsoft.com/office/word/2018/wordml/cex" xmlns:w16cid="http://schemas.microsoft.com/office/word/2016/wordml/cid" xmlns:w16="http://schemas.microsoft.com/office/word/2018/wordml" xmlns:w16sdtdh="http://schemas.microsoft.com/office/word/2020/wordml/sdtdatahash" xmlns:w16se="http://schemas.microsoft.com/office/word/2015/wordml/symex" mc:Ignorable="w14 w15 w16se w16cid w16 w16cex w16sdtdh">
   <w:docDefaults>
     <w:rPrDefault>
       <w:rPr>

</xml_diff>

<commit_message>
Correção do arquivo com a retirada da anamnese. Issue #33
</commit_message>
<xml_diff>
--- a/Requisitos/UC10_Manter Serviço.docx
+++ b/Requisitos/UC10_Manter Serviço.docx
@@ -1689,23 +1689,11 @@
           </w:p>
           <w:p>
             <w:pPr>
-              <w:pBdr>
-                <w:top w:val="nil"/>
-                <w:left w:val="nil"/>
-                <w:bottom w:val="nil"/>
-                <w:right w:val="nil"/>
-                <w:between w:val="nil"/>
-              </w:pBdr>
               <w:ind w:hanging="360"/>
               <w:rPr>
                 <w:sz w:val="28"/>
                 <w:szCs w:val="28"/>
               </w:rPr>
-            </w:pPr>
-          </w:p>
-          <w:p>
-            <w:pPr>
-              <w:ind w:hanging="360"/>
             </w:pPr>
             <w:r>
               <w:rPr>
@@ -1714,206 +1702,8 @@
                 <w:sz w:val="28"/>
                 <w:szCs w:val="28"/>
               </w:rPr>
-              <w:t xml:space="preserve">     Linha 3: </w:t>
-            </w:r>
-            <w:r>
-              <w:rPr>
-                <w:sz w:val="28"/>
-                <w:szCs w:val="28"/>
-              </w:rPr>
-              <w:t>Serviço possui anamnese</w:t>
-            </w:r>
-          </w:p>
-          <w:p>
-            <w:pPr>
-              <w:ind w:hanging="360"/>
-              <w:rPr>
-                <w:sz w:val="28"/>
-                <w:szCs w:val="28"/>
-              </w:rPr>
-            </w:pPr>
-            <w:r>
-              <w:rPr>
-                <w:sz w:val="28"/>
-                <w:szCs w:val="28"/>
-              </w:rPr>
-              <w:t xml:space="preserve">     1. Ator informa que serviço possui </w:t>
-            </w:r>
-            <w:proofErr w:type="spellStart"/>
-            <w:r>
-              <w:rPr>
-                <w:sz w:val="28"/>
-                <w:szCs w:val="28"/>
-              </w:rPr>
-              <w:t>anamense</w:t>
-            </w:r>
-            <w:proofErr w:type="spellEnd"/>
-          </w:p>
-          <w:p>
-            <w:pPr>
-              <w:ind w:hanging="360"/>
-              <w:rPr>
-                <w:sz w:val="28"/>
-                <w:szCs w:val="28"/>
-              </w:rPr>
-            </w:pPr>
-            <w:r>
-              <w:rPr>
-                <w:sz w:val="28"/>
-                <w:szCs w:val="28"/>
-              </w:rPr>
-              <w:t xml:space="preserve">     2. Sistema exibe link de Google </w:t>
-            </w:r>
-            <w:proofErr w:type="spellStart"/>
-            <w:r>
-              <w:rPr>
-                <w:sz w:val="28"/>
-                <w:szCs w:val="28"/>
-              </w:rPr>
-              <w:t>Forms</w:t>
-            </w:r>
-            <w:proofErr w:type="spellEnd"/>
-            <w:r>
-              <w:rPr>
-                <w:sz w:val="28"/>
-                <w:szCs w:val="28"/>
-              </w:rPr>
-              <w:t xml:space="preserve"> para profissional preencher a </w:t>
-            </w:r>
-            <w:proofErr w:type="spellStart"/>
-            <w:r>
-              <w:rPr>
-                <w:sz w:val="28"/>
-                <w:szCs w:val="28"/>
-              </w:rPr>
-              <w:t>anamense</w:t>
-            </w:r>
-            <w:proofErr w:type="spellEnd"/>
-            <w:r>
-              <w:rPr>
-                <w:sz w:val="28"/>
-                <w:szCs w:val="28"/>
-              </w:rPr>
-              <w:t xml:space="preserve"> e conclui adição (</w:t>
-            </w:r>
-            <w:r>
-              <w:rPr>
-                <w:color w:val="FF0000"/>
-                <w:sz w:val="28"/>
-                <w:szCs w:val="28"/>
-              </w:rPr>
-              <w:t>Tela_02</w:t>
-            </w:r>
-            <w:r>
-              <w:rPr>
-                <w:color w:val="FF0000"/>
-                <w:sz w:val="28"/>
-                <w:szCs w:val="28"/>
-              </w:rPr>
-              <w:t>6</w:t>
-            </w:r>
-            <w:r>
-              <w:rPr>
-                <w:sz w:val="28"/>
-                <w:szCs w:val="28"/>
-              </w:rPr>
-              <w:t>).</w:t>
-            </w:r>
-          </w:p>
-          <w:p>
-            <w:pPr>
-              <w:rPr>
-                <w:sz w:val="28"/>
-                <w:szCs w:val="28"/>
-              </w:rPr>
-            </w:pPr>
-            <w:r>
-              <w:rPr>
-                <w:sz w:val="28"/>
-                <w:szCs w:val="28"/>
-              </w:rPr>
-              <w:t xml:space="preserve">3. Sistema verifica a validade dos dados conforme </w:t>
-            </w:r>
-            <w:r>
-              <w:rPr>
-                <w:color w:val="FF0000"/>
-                <w:sz w:val="28"/>
-                <w:szCs w:val="28"/>
-              </w:rPr>
-              <w:t>DD-</w:t>
-            </w:r>
-            <w:proofErr w:type="spellStart"/>
-            <w:r>
-              <w:rPr>
-                <w:color w:val="FF0000"/>
-                <w:sz w:val="28"/>
-                <w:szCs w:val="28"/>
-              </w:rPr>
-              <w:t>BemMeCare</w:t>
-            </w:r>
-            <w:proofErr w:type="spellEnd"/>
-            <w:r>
-              <w:rPr>
-                <w:sz w:val="28"/>
-                <w:szCs w:val="28"/>
-              </w:rPr>
-              <w:t>.</w:t>
-            </w:r>
-          </w:p>
-          <w:p>
-            <w:pPr>
-              <w:rPr>
-                <w:sz w:val="28"/>
-                <w:szCs w:val="28"/>
-              </w:rPr>
-            </w:pPr>
-            <w:r>
-              <w:rPr>
-                <w:sz w:val="28"/>
-                <w:szCs w:val="28"/>
-              </w:rPr>
-              <w:t>4. Sistema grava dados informados em meio persistente.</w:t>
-            </w:r>
-          </w:p>
-          <w:p>
-            <w:pPr>
-              <w:ind w:hanging="360"/>
-              <w:rPr>
-                <w:sz w:val="28"/>
-                <w:szCs w:val="28"/>
-              </w:rPr>
-            </w:pPr>
-            <w:r>
-              <w:rPr>
-                <w:sz w:val="28"/>
-                <w:szCs w:val="28"/>
-              </w:rPr>
-              <w:t xml:space="preserve">     5. Sistema retorna ao Passo 2 da </w:t>
-            </w:r>
-            <w:r>
-              <w:rPr>
-                <w:color w:val="FF0000"/>
-                <w:sz w:val="28"/>
-                <w:szCs w:val="28"/>
-              </w:rPr>
-              <w:t>Seção Principal</w:t>
-            </w:r>
-            <w:r>
-              <w:rPr>
-                <w:sz w:val="28"/>
-                <w:szCs w:val="28"/>
-              </w:rPr>
-              <w:t>.</w:t>
-            </w:r>
-          </w:p>
-          <w:p>
-            <w:pPr>
-              <w:ind w:hanging="360"/>
-              <w:rPr>
-                <w:sz w:val="28"/>
-                <w:szCs w:val="28"/>
-              </w:rPr>
-            </w:pPr>
+              <w:t xml:space="preserve">   </w:t>
+            </w:r>
           </w:p>
           <w:p>
             <w:pPr>
@@ -2660,6 +2450,7 @@
               <w:rPr>
                 <w:color w:val="000000"/>
               </w:rPr>
+              <w:lastRenderedPageBreak/>
               <w:t>Fluxo Principal</w:t>
             </w:r>
           </w:p>
@@ -4196,7 +3987,6 @@
               <w:jc w:val="center"/>
             </w:pPr>
             <w:r>
-              <w:lastRenderedPageBreak/>
               <w:t>02/07/2026</w:t>
             </w:r>
           </w:p>
@@ -4312,6 +4102,9 @@
             </w:pPr>
             <w:r>
               <w:t>Acrescenta maior fidelidade às telas</w:t>
+            </w:r>
+            <w:r>
+              <w:t xml:space="preserve"> e retirada do fluxo de anamnese.</w:t>
             </w:r>
           </w:p>
         </w:tc>
@@ -5356,6 +5149,13 @@
       </w:tblCellMar>
     </w:tblPr>
   </w:style>
+  <w:style w:type="paragraph" w:styleId="Reviso">
+    <w:name w:val="Revision"/>
+    <w:hidden/>
+    <w:uiPriority w:val="99"/>
+    <w:semiHidden/>
+    <w:rsid w:val="0082751B"/>
+  </w:style>
 </w:styles>
 </file>
 

</xml_diff>

<commit_message>
Atualização do caso de uso Manter Serviço. Issue #33
</commit_message>
<xml_diff>
--- a/Requisitos/UC10_Manter Serviço.docx
+++ b/Requisitos/UC10_Manter Serviço.docx
@@ -1,6 +1,6 @@
 
 <file path=word/document.xml><?xml version="1.0" encoding="utf-8"?>
-<w:document xmlns:wpc="http://schemas.microsoft.com/office/word/2010/wordprocessingCanvas" xmlns:cx="http://schemas.microsoft.com/office/drawing/2014/chartex" xmlns:cx1="http://schemas.microsoft.com/office/drawing/2015/9/8/chartex" xmlns:cx2="http://schemas.microsoft.com/office/drawing/2015/10/21/chartex" xmlns:cx3="http://schemas.microsoft.com/office/drawing/2016/5/9/chartex" xmlns:cx4="http://schemas.microsoft.com/office/drawing/2016/5/10/chartex" xmlns:cx5="http://schemas.microsoft.com/office/drawing/2016/5/11/chartex" xmlns:cx6="http://schemas.microsoft.com/office/drawing/2016/5/12/chartex" xmlns:cx7="http://schemas.microsoft.com/office/drawing/2016/5/13/chartex" xmlns:cx8="http://schemas.microsoft.com/office/drawing/2016/5/14/chartex" xmlns:mc="http://schemas.openxmlformats.org/markup-compatibility/2006" xmlns:aink="http://schemas.microsoft.com/office/drawing/2016/ink" xmlns:am3d="http://schemas.microsoft.com/office/drawing/2017/model3d" xmlns:o="urn:schemas-microsoft-com:office:office" xmlns:oel="http://schemas.microsoft.com/office/2019/extlst" xmlns:r="http://schemas.openxmlformats.org/officeDocument/2006/relationships" xmlns:m="http://schemas.openxmlformats.org/officeDocument/2006/math" xmlns:v="urn:schemas-microsoft-com:vml" xmlns:wp14="http://schemas.microsoft.com/office/word/2010/wordprocessingDrawing" xmlns:wp="http://schemas.openxmlformats.org/drawingml/2006/wordprocessingDrawing" xmlns:w10="urn:schemas-microsoft-com:office:word" xmlns:w="http://schemas.openxmlformats.org/wordprocessingml/2006/main" xmlns:w14="http://schemas.microsoft.com/office/word/2010/wordml" xmlns:w15="http://schemas.microsoft.com/office/word/2012/wordml" xmlns:w16cex="http://schemas.microsoft.com/office/word/2018/wordml/cex" xmlns:w16cid="http://schemas.microsoft.com/office/word/2016/wordml/cid" xmlns:w16="http://schemas.microsoft.com/office/word/2018/wordml" xmlns:w16du="http://schemas.microsoft.com/office/word/2023/wordml/word16du" xmlns:w16sdtdh="http://schemas.microsoft.com/office/word/2020/wordml/sdtdatahash" xmlns:w16se="http://schemas.microsoft.com/office/word/2015/wordml/symex" xmlns:wpg="http://schemas.microsoft.com/office/word/2010/wordprocessingGroup" xmlns:wpi="http://schemas.microsoft.com/office/word/2010/wordprocessingInk" xmlns:wne="http://schemas.microsoft.com/office/word/2006/wordml" xmlns:wps="http://schemas.microsoft.com/office/word/2010/wordprocessingShape" mc:Ignorable="w14 w15 w16se w16cid w16 w16cex w16sdtdh wp14">
+<w:document xmlns:wpc="http://schemas.microsoft.com/office/word/2010/wordprocessingCanvas" xmlns:cx="http://schemas.microsoft.com/office/drawing/2014/chartex" xmlns:cx1="http://schemas.microsoft.com/office/drawing/2015/9/8/chartex" xmlns:cx2="http://schemas.microsoft.com/office/drawing/2015/10/21/chartex" xmlns:cx3="http://schemas.microsoft.com/office/drawing/2016/5/9/chartex" xmlns:cx4="http://schemas.microsoft.com/office/drawing/2016/5/10/chartex" xmlns:cx5="http://schemas.microsoft.com/office/drawing/2016/5/11/chartex" xmlns:cx6="http://schemas.microsoft.com/office/drawing/2016/5/12/chartex" xmlns:cx7="http://schemas.microsoft.com/office/drawing/2016/5/13/chartex" xmlns:cx8="http://schemas.microsoft.com/office/drawing/2016/5/14/chartex" xmlns:mc="http://schemas.openxmlformats.org/markup-compatibility/2006" xmlns:aink="http://schemas.microsoft.com/office/drawing/2016/ink" xmlns:am3d="http://schemas.microsoft.com/office/drawing/2017/model3d" xmlns:o="urn:schemas-microsoft-com:office:office" xmlns:r="http://schemas.openxmlformats.org/officeDocument/2006/relationships" xmlns:m="http://schemas.openxmlformats.org/officeDocument/2006/math" xmlns:v="urn:schemas-microsoft-com:vml" xmlns:wp14="http://schemas.microsoft.com/office/word/2010/wordprocessingDrawing" xmlns:wp="http://schemas.openxmlformats.org/drawingml/2006/wordprocessingDrawing" xmlns:w10="urn:schemas-microsoft-com:office:word" xmlns:w="http://schemas.openxmlformats.org/wordprocessingml/2006/main" xmlns:w14="http://schemas.microsoft.com/office/word/2010/wordml" xmlns:w15="http://schemas.microsoft.com/office/word/2012/wordml" xmlns:w16cid="http://schemas.microsoft.com/office/word/2016/wordml/cid" xmlns:w16se="http://schemas.microsoft.com/office/word/2015/wordml/symex" xmlns:wpg="http://schemas.microsoft.com/office/word/2010/wordprocessingGroup" xmlns:wpi="http://schemas.microsoft.com/office/word/2010/wordprocessingInk" xmlns:wne="http://schemas.microsoft.com/office/word/2006/wordml" xmlns:wps="http://schemas.microsoft.com/office/word/2010/wordprocessingShape" mc:Ignorable="w14 w15 w16se w16cid wp14">
   <w:body>
     <w:p>
       <w:pPr>
@@ -1346,7 +1346,23 @@
                 <w:sz w:val="28"/>
                 <w:szCs w:val="28"/>
               </w:rPr>
-              <w:t xml:space="preserve">Sistema exibe formulário em branco para preenchimento dos dados dos serviços (ver </w:t>
+              <w:t xml:space="preserve">Sistema exibe </w:t>
+            </w:r>
+            <w:r>
+              <w:rPr>
+                <w:color w:val="000000"/>
+                <w:sz w:val="28"/>
+                <w:szCs w:val="28"/>
+              </w:rPr>
+              <w:t xml:space="preserve">os campos “Nome do serviço” e “Categoria” para </w:t>
+            </w:r>
+            <w:r>
+              <w:rPr>
+                <w:color w:val="000000"/>
+                <w:sz w:val="28"/>
+                <w:szCs w:val="28"/>
+              </w:rPr>
+              <w:t xml:space="preserve">preenchimento dos dados dos serviços (ver </w:t>
             </w:r>
             <w:r>
               <w:rPr>
@@ -1380,7 +1396,15 @@
                 <w:sz w:val="28"/>
                 <w:szCs w:val="28"/>
               </w:rPr>
-              <w:t>Tela_026</w:t>
+              <w:t>Tela_02</w:t>
+            </w:r>
+            <w:r>
+              <w:rPr>
+                <w:color w:val="FF0000"/>
+                <w:sz w:val="28"/>
+                <w:szCs w:val="28"/>
+              </w:rPr>
+              <w:t>4</w:t>
             </w:r>
             <w:r>
               <w:rPr>
@@ -1702,130 +1726,7 @@
                 <w:sz w:val="28"/>
                 <w:szCs w:val="28"/>
               </w:rPr>
-              <w:t xml:space="preserve">   </w:t>
-            </w:r>
-          </w:p>
-          <w:p>
-            <w:pPr>
-              <w:ind w:hanging="360"/>
-            </w:pPr>
-            <w:r>
-              <w:rPr>
-                <w:b/>
-                <w:bCs/>
-                <w:sz w:val="28"/>
-                <w:szCs w:val="28"/>
-              </w:rPr>
-              <w:t xml:space="preserve">     Linha 3: </w:t>
-            </w:r>
-            <w:r>
-              <w:rPr>
-                <w:sz w:val="28"/>
-                <w:szCs w:val="28"/>
-              </w:rPr>
-              <w:t>Serviço possui pagamento de sinal</w:t>
-            </w:r>
-          </w:p>
-          <w:p>
-            <w:pPr>
-              <w:ind w:hanging="360"/>
-              <w:rPr>
-                <w:sz w:val="28"/>
-                <w:szCs w:val="28"/>
-              </w:rPr>
-            </w:pPr>
-            <w:r>
-              <w:rPr>
-                <w:sz w:val="28"/>
-                <w:szCs w:val="28"/>
-              </w:rPr>
-              <w:t xml:space="preserve">     1. Ator informa que serviço tem sinal obrigatório e conclui adição</w:t>
-            </w:r>
-          </w:p>
-          <w:p>
-            <w:pPr>
-              <w:rPr>
-                <w:sz w:val="28"/>
-                <w:szCs w:val="28"/>
-              </w:rPr>
-            </w:pPr>
-            <w:r>
-              <w:rPr>
-                <w:sz w:val="28"/>
-                <w:szCs w:val="28"/>
-              </w:rPr>
-              <w:t xml:space="preserve">2. Sistema verifica a validade dos dados conforme </w:t>
-            </w:r>
-            <w:r>
-              <w:rPr>
-                <w:color w:val="FF0000"/>
-                <w:sz w:val="28"/>
-                <w:szCs w:val="28"/>
-              </w:rPr>
-              <w:t>DD-</w:t>
-            </w:r>
-            <w:proofErr w:type="spellStart"/>
-            <w:r>
-              <w:rPr>
-                <w:color w:val="FF0000"/>
-                <w:sz w:val="28"/>
-                <w:szCs w:val="28"/>
-              </w:rPr>
-              <w:t>BemMeCare</w:t>
-            </w:r>
-            <w:proofErr w:type="spellEnd"/>
-            <w:r>
-              <w:rPr>
-                <w:sz w:val="28"/>
-                <w:szCs w:val="28"/>
-              </w:rPr>
-              <w:t>.</w:t>
-            </w:r>
-          </w:p>
-          <w:p>
-            <w:pPr>
-              <w:rPr>
-                <w:sz w:val="28"/>
-                <w:szCs w:val="28"/>
-              </w:rPr>
-            </w:pPr>
-            <w:r>
-              <w:rPr>
-                <w:sz w:val="28"/>
-                <w:szCs w:val="28"/>
-              </w:rPr>
-              <w:t>3. Sistema grava dados informados em meio persistente.</w:t>
-            </w:r>
-          </w:p>
-          <w:p>
-            <w:pPr>
-              <w:ind w:hanging="360"/>
-              <w:rPr>
-                <w:sz w:val="28"/>
-                <w:szCs w:val="28"/>
-              </w:rPr>
-            </w:pPr>
-            <w:r>
-              <w:rPr>
-                <w:sz w:val="28"/>
-                <w:szCs w:val="28"/>
-              </w:rPr>
-              <w:t xml:space="preserve">     4. Sistema retorna ao Passo 2 da </w:t>
-            </w:r>
-            <w:r>
-              <w:rPr>
-                <w:color w:val="FF0000"/>
-                <w:sz w:val="28"/>
-                <w:szCs w:val="28"/>
-              </w:rPr>
-              <w:t>Seção Principal</w:t>
-            </w:r>
-            <w:r>
-              <w:rPr>
-                <w:sz w:val="28"/>
-                <w:szCs w:val="28"/>
-              </w:rPr>
-              <w:t>.</w:t>
+              <w:t xml:space="preserve">  </w:t>
             </w:r>
           </w:p>
         </w:tc>
@@ -2450,7 +2351,6 @@
               <w:rPr>
                 <w:color w:val="000000"/>
               </w:rPr>
-              <w:lastRenderedPageBreak/>
               <w:t>Fluxo Principal</w:t>
             </w:r>
           </w:p>
@@ -2900,6 +2800,7 @@
                 <w:sz w:val="28"/>
                 <w:szCs w:val="28"/>
               </w:rPr>
+              <w:lastRenderedPageBreak/>
               <w:t>Linha 6</w:t>
             </w:r>
             <w:r>
@@ -3347,7 +3248,7 @@
                 <w:sz w:val="28"/>
                 <w:szCs w:val="28"/>
               </w:rPr>
-              <w:t xml:space="preserve">Sistema exibe formulário com os dados atuais do serviço </w:t>
+              <w:t xml:space="preserve">Sistema exibe os dados atuais do serviço </w:t>
             </w:r>
             <w:r>
               <w:rPr>
@@ -4113,7 +4014,12 @@
     <w:p>
       <w:pPr>
         <w:jc w:val="center"/>
-      </w:pPr>
+        <w:rPr>
+          <w:u w:val="single"/>
+        </w:rPr>
+      </w:pPr>
+      <w:bookmarkStart w:id="3" w:name="_GoBack"/>
+      <w:bookmarkEnd w:id="3"/>
     </w:p>
     <w:sectPr>
       <w:pgSz w:w="11906" w:h="16838"/>
@@ -4126,7 +4032,7 @@
 </file>
 
 <file path=word/numbering.xml><?xml version="1.0" encoding="utf-8"?>
-<w:numbering xmlns:wpc="http://schemas.microsoft.com/office/word/2010/wordprocessingCanvas" xmlns:cx="http://schemas.microsoft.com/office/drawing/2014/chartex" xmlns:cx1="http://schemas.microsoft.com/office/drawing/2015/9/8/chartex" xmlns:cx2="http://schemas.microsoft.com/office/drawing/2015/10/21/chartex" xmlns:cx3="http://schemas.microsoft.com/office/drawing/2016/5/9/chartex" xmlns:cx4="http://schemas.microsoft.com/office/drawing/2016/5/10/chartex" xmlns:cx5="http://schemas.microsoft.com/office/drawing/2016/5/11/chartex" xmlns:cx6="http://schemas.microsoft.com/office/drawing/2016/5/12/chartex" xmlns:cx7="http://schemas.microsoft.com/office/drawing/2016/5/13/chartex" xmlns:cx8="http://schemas.microsoft.com/office/drawing/2016/5/14/chartex" xmlns:mc="http://schemas.openxmlformats.org/markup-compatibility/2006" xmlns:aink="http://schemas.microsoft.com/office/drawing/2016/ink" xmlns:am3d="http://schemas.microsoft.com/office/drawing/2017/model3d" xmlns:o="urn:schemas-microsoft-com:office:office" xmlns:oel="http://schemas.microsoft.com/office/2019/extlst" xmlns:r="http://schemas.openxmlformats.org/officeDocument/2006/relationships" xmlns:m="http://schemas.openxmlformats.org/officeDocument/2006/math" xmlns:v="urn:schemas-microsoft-com:vml" xmlns:wp14="http://schemas.microsoft.com/office/word/2010/wordprocessingDrawing" xmlns:wp="http://schemas.openxmlformats.org/drawingml/2006/wordprocessingDrawing" xmlns:w10="urn:schemas-microsoft-com:office:word" xmlns:w="http://schemas.openxmlformats.org/wordprocessingml/2006/main" xmlns:w14="http://schemas.microsoft.com/office/word/2010/wordml" xmlns:w15="http://schemas.microsoft.com/office/word/2012/wordml" xmlns:w16cex="http://schemas.microsoft.com/office/word/2018/wordml/cex" xmlns:w16cid="http://schemas.microsoft.com/office/word/2016/wordml/cid" xmlns:w16="http://schemas.microsoft.com/office/word/2018/wordml" xmlns:w16du="http://schemas.microsoft.com/office/word/2023/wordml/word16du" xmlns:w16sdtdh="http://schemas.microsoft.com/office/word/2020/wordml/sdtdatahash" xmlns:w16se="http://schemas.microsoft.com/office/word/2015/wordml/symex" xmlns:wpg="http://schemas.microsoft.com/office/word/2010/wordprocessingGroup" xmlns:wpi="http://schemas.microsoft.com/office/word/2010/wordprocessingInk" xmlns:wne="http://schemas.microsoft.com/office/word/2006/wordml" xmlns:wps="http://schemas.microsoft.com/office/word/2010/wordprocessingShape" mc:Ignorable="w14 w15 w16se w16cid w16 w16cex w16sdtdh wp14">
+<w:numbering xmlns:wpc="http://schemas.microsoft.com/office/word/2010/wordprocessingCanvas" xmlns:cx="http://schemas.microsoft.com/office/drawing/2014/chartex" xmlns:cx1="http://schemas.microsoft.com/office/drawing/2015/9/8/chartex" xmlns:cx2="http://schemas.microsoft.com/office/drawing/2015/10/21/chartex" xmlns:cx3="http://schemas.microsoft.com/office/drawing/2016/5/9/chartex" xmlns:cx4="http://schemas.microsoft.com/office/drawing/2016/5/10/chartex" xmlns:cx5="http://schemas.microsoft.com/office/drawing/2016/5/11/chartex" xmlns:cx6="http://schemas.microsoft.com/office/drawing/2016/5/12/chartex" xmlns:cx7="http://schemas.microsoft.com/office/drawing/2016/5/13/chartex" xmlns:cx8="http://schemas.microsoft.com/office/drawing/2016/5/14/chartex" xmlns:mc="http://schemas.openxmlformats.org/markup-compatibility/2006" xmlns:aink="http://schemas.microsoft.com/office/drawing/2016/ink" xmlns:am3d="http://schemas.microsoft.com/office/drawing/2017/model3d" xmlns:o="urn:schemas-microsoft-com:office:office" xmlns:r="http://schemas.openxmlformats.org/officeDocument/2006/relationships" xmlns:m="http://schemas.openxmlformats.org/officeDocument/2006/math" xmlns:v="urn:schemas-microsoft-com:vml" xmlns:wp14="http://schemas.microsoft.com/office/word/2010/wordprocessingDrawing" xmlns:wp="http://schemas.openxmlformats.org/drawingml/2006/wordprocessingDrawing" xmlns:w10="urn:schemas-microsoft-com:office:word" xmlns:w="http://schemas.openxmlformats.org/wordprocessingml/2006/main" xmlns:w14="http://schemas.microsoft.com/office/word/2010/wordml" xmlns:w15="http://schemas.microsoft.com/office/word/2012/wordml" xmlns:w16cid="http://schemas.microsoft.com/office/word/2016/wordml/cid" xmlns:w16se="http://schemas.microsoft.com/office/word/2015/wordml/symex" xmlns:wpg="http://schemas.microsoft.com/office/word/2010/wordprocessingGroup" xmlns:wpi="http://schemas.microsoft.com/office/word/2010/wordprocessingInk" xmlns:wne="http://schemas.microsoft.com/office/word/2006/wordml" xmlns:wps="http://schemas.microsoft.com/office/word/2010/wordprocessingShape" mc:Ignorable="w14 w15 w16se w16cid wp14">
   <w:abstractNum w:abstractNumId="0" w15:restartNumberingAfterBreak="0">
     <w:nsid w:val="25683A48"/>
     <w:multiLevelType w:val="multilevel"/>
@@ -4471,23 +4377,23 @@
       </w:pPr>
     </w:lvl>
   </w:abstractNum>
-  <w:num w:numId="1" w16cid:durableId="793408453">
+  <w:num w:numId="1">
     <w:abstractNumId w:val="3"/>
   </w:num>
-  <w:num w:numId="2" w16cid:durableId="1704093939">
+  <w:num w:numId="2">
     <w:abstractNumId w:val="2"/>
   </w:num>
-  <w:num w:numId="3" w16cid:durableId="925000302">
+  <w:num w:numId="3">
     <w:abstractNumId w:val="1"/>
   </w:num>
-  <w:num w:numId="4" w16cid:durableId="874539938">
+  <w:num w:numId="4">
     <w:abstractNumId w:val="0"/>
   </w:num>
 </w:numbering>
 </file>
 
 <file path=word/styles.xml><?xml version="1.0" encoding="utf-8"?>
-<w:styles xmlns:mc="http://schemas.openxmlformats.org/markup-compatibility/2006" xmlns:r="http://schemas.openxmlformats.org/officeDocument/2006/relationships" xmlns:w="http://schemas.openxmlformats.org/wordprocessingml/2006/main" xmlns:w14="http://schemas.microsoft.com/office/word/2010/wordml" xmlns:w15="http://schemas.microsoft.com/office/word/2012/wordml" xmlns:w16cex="http://schemas.microsoft.com/office/word/2018/wordml/cex" xmlns:w16cid="http://schemas.microsoft.com/office/word/2016/wordml/cid" xmlns:w16="http://schemas.microsoft.com/office/word/2018/wordml" xmlns:w16sdtdh="http://schemas.microsoft.com/office/word/2020/wordml/sdtdatahash" xmlns:w16se="http://schemas.microsoft.com/office/word/2015/wordml/symex" mc:Ignorable="w14 w15 w16se w16cid w16 w16cex w16sdtdh">
+<w:styles xmlns:mc="http://schemas.openxmlformats.org/markup-compatibility/2006" xmlns:r="http://schemas.openxmlformats.org/officeDocument/2006/relationships" xmlns:w="http://schemas.openxmlformats.org/wordprocessingml/2006/main" xmlns:w14="http://schemas.microsoft.com/office/word/2010/wordml" xmlns:w15="http://schemas.microsoft.com/office/word/2012/wordml" xmlns:w16cid="http://schemas.microsoft.com/office/word/2016/wordml/cid" xmlns:w16se="http://schemas.microsoft.com/office/word/2015/wordml/symex" mc:Ignorable="w14 w15 w16se w16cid">
   <w:docDefaults>
     <w:rPrDefault>
       <w:rPr>
@@ -4499,7 +4405,7 @@
     </w:rPrDefault>
     <w:pPrDefault/>
   </w:docDefaults>
-  <w:latentStyles w:defLockedState="0" w:defUIPriority="99" w:defSemiHidden="0" w:defUnhideWhenUsed="0" w:defQFormat="0" w:count="376">
+  <w:latentStyles w:defLockedState="0" w:defUIPriority="99" w:defSemiHidden="0" w:defUnhideWhenUsed="0" w:defQFormat="0" w:count="375">
     <w:lsdException w:name="Normal" w:uiPriority="0" w:qFormat="1"/>
     <w:lsdException w:name="heading 1" w:uiPriority="9" w:qFormat="1"/>
     <w:lsdException w:name="heading 2" w:semiHidden="1" w:uiPriority="9" w:unhideWhenUsed="1" w:qFormat="1"/>
@@ -4875,7 +4781,6 @@
     <w:lsdException w:name="Smart Hyperlink" w:semiHidden="1" w:unhideWhenUsed="1"/>
     <w:lsdException w:name="Hashtag" w:semiHidden="1" w:unhideWhenUsed="1"/>
     <w:lsdException w:name="Unresolved Mention" w:semiHidden="1" w:unhideWhenUsed="1"/>
-    <w:lsdException w:name="Smart Link" w:semiHidden="1" w:unhideWhenUsed="1"/>
   </w:latentStyles>
   <w:style w:type="paragraph" w:default="1" w:styleId="Normal">
     <w:name w:val="Normal"/>

</xml_diff>